<commit_message>
feat: enrich falas with verified 2024-2026 material (INSS 2025, Marco Legal IA, AI Act)
Acréscimos verificados em fontes oficiais, inseridos no corpo e na munição:
- Escândalo dos descontos do INSS (2025): R$ 6,3 bi, 1,6 mi de aposentados,
  97% sem autorização, avisados pelo Meu INSS só depois (espelho complementar,
  enquadrado como falha de governança, não viés algorítmico).
- Marco Legal da IA (PL 2338/2023): aprovado no Senado dez/2024, votação final
  na Câmara; positiva os direitos à explicação e contestação.
- EU AI Act: algoritmos de elegibilidade a benefícios = alto risco (Anexo III).
Aplicado em teleprompter, FALA-ANA (PDF/DOCX), ROTEIRO-COMPLETO (PDF/DOCX),
SCRIPT-COMPLETO, MINHA-FALA e versão Setapp.

Co-Authored-By: Claude Opus 4.7 <noreply@anthropic.com>
</commit_message>
<xml_diff>
--- a/FALA-ANA.docx
+++ b/FALA-ANA.docx
@@ -10,7 +10,7 @@
         <w:t xml:space="preserve">Minha Fala — Seminário 8</w:t>
       </w:r>
     </w:p>
-    <w:bookmarkStart w:id="25" w:name="minha-fala-seminário-8"/>
+    <w:bookmarkStart w:id="28" w:name="minha-fala-seminário-8"/>
     <w:p>
       <w:pPr>
         <w:pStyle w:val="Heading1"/>
@@ -551,6 +551,66 @@
         <w:pStyle w:val="BodyText"/>
       </w:pPr>
       <w:r>
+        <w:rPr>
+          <w:b/>
+          <w:bCs/>
+        </w:rPr>
+        <w:t xml:space="preserve">E não é hipótese de laboratório:</w:t>
+      </w:r>
+      <w:r>
+        <w:t xml:space="preserve"> </w:t>
+      </w:r>
+      <w:r>
+        <w:t xml:space="preserve">em 2025, o próprio INSS notificou pelo Meu INSS mais de</w:t>
+      </w:r>
+      <w:r>
+        <w:t xml:space="preserve"> </w:t>
+      </w:r>
+      <w:r>
+        <w:rPr>
+          <w:b/>
+          <w:bCs/>
+        </w:rPr>
+        <w:t xml:space="preserve">1,6 milhão de aposentados</w:t>
+      </w:r>
+      <w:r>
+        <w:t xml:space="preserve"> </w:t>
+      </w:r>
+      <w:r>
+        <w:t xml:space="preserve">sobre descontos que 97% nunca autorizaram —</w:t>
+      </w:r>
+      <w:r>
+        <w:t xml:space="preserve"> </w:t>
+      </w:r>
+      <w:r>
+        <w:rPr>
+          <w:b/>
+          <w:bCs/>
+        </w:rPr>
+        <w:t xml:space="preserve">R$ 6,3 bilhões</w:t>
+      </w:r>
+      <w:r>
+        <w:t xml:space="preserve">. Não foi viés algorítmico, foi fraude de governança — mas é o mesmo app, o mesmo ator e a mesma lógica: o Estado lesa o segurado e devolve a ele,</w:t>
+      </w:r>
+      <w:r>
+        <w:t xml:space="preserve"> </w:t>
+      </w:r>
+      <w:r>
+        <w:rPr>
+          <w:i/>
+          <w:iCs/>
+        </w:rPr>
+        <w:t xml:space="preserve">depois</w:t>
+      </w:r>
+      <w:r>
+        <w:t xml:space="preserve">, o ônus de contestar.</w:t>
+      </w:r>
+    </w:p>
+    <w:p>
+      <w:pPr>
+        <w:pStyle w:val="BodyText"/>
+      </w:pPr>
+      <w:r>
         <w:t xml:space="preserve">E em vez de só falar disso, a gente vai mostrar. Mas antes, duas camadas que vêm antes do contraditório.</w:t>
       </w:r>
     </w:p>
@@ -669,6 +729,37 @@
         <w:pStyle w:val="BodyText"/>
       </w:pPr>
       <w:r>
+        <w:rPr>
+          <w:b/>
+          <w:bCs/>
+        </w:rPr>
+        <w:t xml:space="preserve">E isso está virando direito positivo:</w:t>
+      </w:r>
+      <w:r>
+        <w:t xml:space="preserve"> </w:t>
+      </w:r>
+      <w:r>
+        <w:t xml:space="preserve">o PL 2338, aprovado no Senado em dezembro de 2024 e em votação final na Câmara, garante a quem sofre uma decisão automatizada o direito à</w:t>
+      </w:r>
+      <w:r>
+        <w:t xml:space="preserve"> </w:t>
+      </w:r>
+      <w:r>
+        <w:rPr>
+          <w:b/>
+          <w:bCs/>
+        </w:rPr>
+        <w:t xml:space="preserve">explicação e à contestação</w:t>
+      </w:r>
+      <w:r>
+        <w:t xml:space="preserve">. A nossa tese é, em boa parte, o que o legislador está prestes a positivar.</w:t>
+      </w:r>
+    </w:p>
+    <w:p>
+      <w:pPr>
+        <w:pStyle w:val="BodyText"/>
+      </w:pPr>
+      <w:r>
         <w:t xml:space="preserve">E agora a gente mostra como isso poderia virar uma ferramenta.</w:t>
       </w:r>
     </w:p>
@@ -910,7 +1001,7 @@
       </w:r>
     </w:p>
     <w:bookmarkEnd w:id="16"/>
-    <w:bookmarkStart w:id="22" w:name="debatecaixa-de-munição"/>
+    <w:bookmarkStart w:id="25" w:name="debatecaixa-de-munição"/>
     <w:p>
       <w:pPr>
         <w:pStyle w:val="Heading2"/>
@@ -976,12 +1067,66 @@
       </w:r>
     </w:p>
     <w:bookmarkEnd w:id="19"/>
-    <w:bookmarkStart w:id="20" w:name="se-perguntarem-se-o-protótipo-é-solução"/>
+    <w:bookmarkStart w:id="20" w:name="eu-ai-act-europa"/>
     <w:p>
       <w:pPr>
         <w:pStyle w:val="Heading3"/>
       </w:pPr>
       <w:r>
+        <w:t xml:space="preserve">EU AI Act (Europa)</w:t>
+      </w:r>
+    </w:p>
+    <w:p>
+      <w:pPr>
+        <w:pStyle w:val="FirstParagraph"/>
+      </w:pPr>
+      <w:r>
+        <w:t xml:space="preserve">Algoritmos que decidem elegibilidade a benefícios sociais são "alto risco" (Anexo III). O caso INSS, na taxonomia europeia, exigiria auditoria, explicabilidade e supervisão humana obrigatórias. Regras de alto risco vigentes a partir de agosto de 2026.</w:t>
+      </w:r>
+    </w:p>
+    <w:bookmarkEnd w:id="20"/>
+    <w:bookmarkStart w:id="21" w:name="descontos-do-inss-2025"/>
+    <w:p>
+      <w:pPr>
+        <w:pStyle w:val="Heading3"/>
+      </w:pPr>
+      <w:r>
+        <w:t xml:space="preserve">Descontos do INSS (2025)</w:t>
+      </w:r>
+    </w:p>
+    <w:p>
+      <w:pPr>
+        <w:pStyle w:val="FirstParagraph"/>
+      </w:pPr>
+      <w:r>
+        <w:t xml:space="preserve">Desde 2019, descontos associativos em benefícios — 97% não autorizados, R$ 6,3 bilhões, mais de 1,6 milhão de aposentados, CPMI no Congresso. Avisados pelo Meu INSS só depois. Mesmo ator, mesmo app: o Estado lesa e terceiriza ao cidadão o ônus de contestar.</w:t>
+      </w:r>
+    </w:p>
+    <w:bookmarkEnd w:id="21"/>
+    <w:bookmarkStart w:id="22" w:name="marco-legal-da-ia-pl-23382023"/>
+    <w:p>
+      <w:pPr>
+        <w:pStyle w:val="Heading3"/>
+      </w:pPr>
+      <w:r>
+        <w:t xml:space="preserve">Marco Legal da IA (PL 2338/2023)</w:t>
+      </w:r>
+    </w:p>
+    <w:p>
+      <w:pPr>
+        <w:pStyle w:val="FirstParagraph"/>
+      </w:pPr>
+      <w:r>
+        <w:t xml:space="preserve">Aprovado no Senado em dez/2024, em votação final na Câmara (aprovação esperada em 2026). Modelo europeu por risco; garante ao afetado direito à informação, explicação e contestação de decisões automatizadas. Apontado vício de iniciativa no trecho sobre competências da ANPD — até a lei da IA esbarra na tensão de quem regula quem.</w:t>
+      </w:r>
+    </w:p>
+    <w:bookmarkEnd w:id="22"/>
+    <w:bookmarkStart w:id="23" w:name="se-perguntarem-se-o-protótipo-é-solução"/>
+    <w:p>
+      <w:pPr>
+        <w:pStyle w:val="Heading3"/>
+      </w:pPr>
+      <w:r>
         <w:t xml:space="preserve">Se perguntarem se o protótipo é "solução"</w:t>
       </w:r>
     </w:p>
@@ -993,8 +1138,8 @@
         <w:t xml:space="preserve">Não. É uma maquete crítica. Não resolve a política pública — torna visível a lacuna: hoje a pessoa recebe uma decisão automatizada sem compreender, participar ou contestar tecnicamente.</w:t>
       </w:r>
     </w:p>
-    <w:bookmarkEnd w:id="20"/>
-    <w:bookmarkStart w:id="21" w:name="Xe0eaf6513dc5b842f5b60587bdc3dcff24f2652"/>
+    <w:bookmarkEnd w:id="23"/>
+    <w:bookmarkStart w:id="24" w:name="Xe0eaf6513dc5b842f5b60587bdc3dcff24f2652"/>
     <w:p>
       <w:pPr>
         <w:pStyle w:val="Heading3"/>
@@ -1011,9 +1156,9 @@
         <w:t xml:space="preserve">A pergunta não é velocidade contra direitos, é qual velocidade é constitucionalmente aceitável. Decidir rápido uma negativa ilegítima não é eficiência — é dano administrativamente acelerado.</w:t>
       </w:r>
     </w:p>
-    <w:bookmarkEnd w:id="21"/>
-    <w:bookmarkEnd w:id="22"/>
-    <w:bookmarkStart w:id="23" w:name="X0c4e5fcbadea03043bf55361875b65f67943d72"/>
+    <w:bookmarkEnd w:id="24"/>
+    <w:bookmarkEnd w:id="25"/>
+    <w:bookmarkStart w:id="26" w:name="X0c4e5fcbadea03043bf55361875b65f67943d72"/>
     <w:p>
       <w:pPr>
         <w:pStyle w:val="Heading2"/>
@@ -1215,8 +1360,8 @@
         </w:tc>
       </w:tr>
     </w:tbl>
-    <w:bookmarkEnd w:id="23"/>
-    <w:bookmarkStart w:id="24" w:name="antes-de-falar30-segundos"/>
+    <w:bookmarkEnd w:id="26"/>
+    <w:bookmarkStart w:id="27" w:name="antes-de-falar30-segundos"/>
     <w:p>
       <w:pPr>
         <w:pStyle w:val="Heading2"/>
@@ -1254,7 +1399,7 @@
         <w:t xml:space="preserve">o Estado digital só é legítimo se a pessoa entende, contesta e é tratada como pessoa.</w:t>
       </w:r>
     </w:p>
-    <w:bookmarkEnd w:id="24"/>
+    <w:bookmarkEnd w:id="27"/>
     <w:p>
       <w:pPr>
         <w:pStyle w:val="BodyText"/>
@@ -1263,7 +1408,7 @@
         <w:t xml:space="preserve">Seminário 8 · PPGD/UFSC · roteiro pessoal da Ana — para falar, não ler · gerado em 25/05/2026</w:t>
       </w:r>
     </w:p>
-    <w:bookmarkEnd w:id="25"/>
+    <w:bookmarkEnd w:id="28"/>
     <w:sectPr>
       <w:footnotePr>
         <w:numRestart w:val="eachSect"/>

</xml_diff>